<commit_message>
Fix 6.7.1 and Parte 5 ordering (Juan Riquelme & Victor Carraly)
</commit_message>
<xml_diff>
--- a/Relatorio.docx
+++ b/Relatorio.docx
@@ -4006,29 +4006,13 @@
         <w:rPr>
           <w:rtl w:val="0"/>
         </w:rPr>
-        <w:t xml:space="preserve">5.4 (extra) - Gráfico limiar × tempo (cole a imagem) e descrição do formato da curva:</w:t>
-      </w:r>
-    </w:p>
-    <w:p>
-      <w:pPr>
-        <w:rPr/>
-      </w:pPr>
-      <w:r>
-        <w:rPr>
-          <w:rtl w:val="0"/>
-        </w:rPr>
-      </w:r>
-    </w:p>
-    <w:p>
-      <w:pPr>
-        <w:rPr/>
-      </w:pPr>
-      <w:r>
-        <w:rPr>
-          <w:rtl w:val="0"/>
-        </w:rPr>
-        <w:t xml:space="preserve"> Curva em sino (π). Pico em LIMIAR=128 (probabilidade 50% do if ser true = máxima imprevisibilidade = máximo de mispredictions = mais lento). Cai simetricamente para limiares extremos (0 e 256 = previsível = rápido). O tempo acompanha a entropia da previsão: máximo quando P(taken)=0.5.</w:t>
-      </w:r>
+      </w:r>
+    </w:p>
+    <w:p>
+      <w:pPr>
+        <w:rPr/>
+      </w:pPr>
+      <w:r/>
     </w:p>
     <w:p>
       <w:pPr>
@@ -4124,6 +4108,11 @@
       </w:r>
     </w:p>
     <w:p>
+      <w:r>
+        <w:t>5.4 (extra) - Gráfico limiar × tempo (cole a imagem) e descrição do formato da curva: Curva em sino. Pico em LIMIAR=128 (probabilidade 50% do if ser true = máxima imprevisibilidade = máximo de mispredictions = mais lento). Cai simetricamente para limiares extremos (0 e 256 = previsível = rápido). O tempo acompanha a entropia da previsão: máximo quando P(taken)=0.5.</w:t>
+      </w:r>
+    </w:p>
+    <w:p>
       <w:pPr>
         <w:keepNext w:val="0"/>
         <w:keepLines w:val="0"/>
@@ -4162,52 +4151,7 @@
       <w:pPr>
         <w:rPr/>
       </w:pPr>
-      <w:r>
-        <w:rPr>
-          <w:rtl w:val="0"/>
-        </w:rPr>
-        <w:t xml:space="preserve"> Curva em sino invertida (π). Pico em LIMIAR=128 (probabilidade 50% do if ser true = máxima imprevisibilidade). Cai simetricamente para limiares extremos (0 e 256 = previsível = rápido). O tempo acompanha a entropia da previsão: máximo quando P(taken)=0.5.</w:t>
-      </w:r>
-      <w:r>
-        <w:rPr/>
-        <w:drawing>
-          <wp:inline distB="0" distT="0" distL="114300" distR="114300">
-            <wp:extent cx="5029200" cy="3143250"/>
-            <wp:effectExtent b="0" l="0" r="0" t="0"/>
-            <wp:docPr id="1" name="image1.png"/>
-            <a:graphic>
-              <a:graphicData uri="http://schemas.openxmlformats.org/drawingml/2006/picture">
-                <pic:pic>
-                  <pic:nvPicPr>
-                    <pic:cNvPr id="0" name="image1.png"/>
-                    <pic:cNvPicPr preferRelativeResize="0"/>
-                  </pic:nvPicPr>
-                  <pic:blipFill>
-                    <a:blip r:embed="rId6"/>
-                    <a:srcRect b="0" l="0" r="0" t="0"/>
-                    <a:stretch>
-                      <a:fillRect/>
-                    </a:stretch>
-                  </pic:blipFill>
-                  <pic:spPr>
-                    <a:xfrm>
-                      <a:off x="0" y="0"/>
-                      <a:ext cx="5029200" cy="3143250"/>
-                    </a:xfrm>
-                    <a:prstGeom prst="rect"/>
-                    <a:ln/>
-                  </pic:spPr>
-                </pic:pic>
-              </a:graphicData>
-            </a:graphic>
-          </wp:inline>
-        </w:drawing>
-      </w:r>
-      <w:r>
-        <w:rPr>
-          <w:rtl w:val="0"/>
-        </w:rPr>
-      </w:r>
+      <w:r/>
     </w:p>
     <w:p>
       <w:pPr>
@@ -5248,7 +5192,7 @@
         <w:rPr/>
       </w:pPr>
       <w:r>
-        <w:t>6.7.1 - Quanto o forwarding economizou? 114 - 88 = 26 ciclos (23% melhoria). O forwarding encaminha resultados de ALU/MEM para estágios anteriores, resolvendo a maioria dos hazards RAW (ex: add → blt).</w:t>
+        <w:t>114 − 88 = 26 ciclos (23% de melhoria). O forwarding encaminha resultados de ALU/MEM para estágios anteriores, resolvendo a maioria dos hazards RAW (ex: add → blt). No entanto, o hazard load-use (lw → blt) não é totalmente eliminado: ainda resta 1 bolha (stall), porque o dado da memória só fica disponível no fim do estágio MEM, tarde demais para o EX do blt no ciclo seguinte. O ganho de 26 ciclos vem de evitar os stalls dos outros hazards RAW (ex: addi → blt), que o forwarding resolve por completo.</w:t>
       </w:r>
     </w:p>
     <w:p>

</xml_diff>